<commit_message>
feat(document-generation): expose agent kind, director title, and director basis to invoice template
Adds isIndividualEntrepreneur/isOrganization flags so the Russian invoice
can branch between IP and legal-entity layouts, plus agentDirectorTitle
and agentDirectorBasis localized fields for signature blocks.

Co-Authored-By: Claude Opus 4.7 (1M context) <noreply@anthropic.com>
</commit_message>
<xml_diff>
--- a/packages/workflows/document-generation/templates/ru_invoice.docx
+++ b/packages/workflows/document-generation/templates/ru_invoice.docx
@@ -11,52 +11,25 @@
         </w:rPr>
       </w:pPr>
       <w:r>
-        <w:drawing>
-          <wp:anchor distT="0" distB="179705" distL="114300" distR="114300" simplePos="0" relativeHeight="3" behindDoc="0" locked="0" layoutInCell="0" allowOverlap="1">
-            <wp:simplePos x="0" y="0"/>
-            <wp:positionH relativeFrom="column">
-              <wp:posOffset>4625340</wp:posOffset>
-            </wp:positionH>
-            <wp:positionV relativeFrom="paragraph">
-              <wp:posOffset>-36195</wp:posOffset>
-            </wp:positionV>
-            <wp:extent cx="2063750" cy="1247775"/>
-            <wp:effectExtent l="0" t="0" r="0" b="0"/>
-            <wp:wrapSquare wrapText="bothSides"/>
-            <wp:docPr id="1" name="Рисунок 6" descr="Логотип"/>
-            <wp:cNvGraphicFramePr>
-              <a:graphicFrameLocks xmlns:a="http://schemas.openxmlformats.org/drawingml/2006/main" noChangeAspect="1"/>
-            </wp:cNvGraphicFramePr>
-            <a:graphic xmlns:a="http://schemas.openxmlformats.org/drawingml/2006/main">
-              <a:graphicData uri="http://schemas.openxmlformats.org/drawingml/2006/picture">
-                <pic:pic xmlns:pic="http://schemas.openxmlformats.org/drawingml/2006/picture">
-                  <pic:nvPicPr>
-                    <pic:cNvPr id="1" name="Рисунок 6" descr="Логотип"/>
-                    <pic:cNvPicPr>
-                      <a:picLocks noChangeAspect="1" noChangeArrowheads="1"/>
-                    </pic:cNvPicPr>
-                  </pic:nvPicPr>
-                  <pic:blipFill>
-                    <a:blip r:embed="rId2"/>
-                    <a:stretch>
-                      <a:fillRect/>
-                    </a:stretch>
-                  </pic:blipFill>
-                  <pic:spPr bwMode="auto">
-                    <a:xfrm>
-                      <a:off x="0" y="0"/>
-                      <a:ext cx="2063750" cy="1247775"/>
-                    </a:xfrm>
-                    <a:prstGeom prst="rect">
-                      <a:avLst/>
-                    </a:prstGeom>
-                    <a:noFill/>
-                  </pic:spPr>
-                </pic:pic>
-              </a:graphicData>
-            </a:graphic>
-          </wp:anchor>
-        </w:drawing>
+        <w:rPr>
+          <w:color w:themeColor="text1" w:val="000000"/>
+          <w:shd w:fill="auto" w:val="clear"/>
+        </w:rPr>
+        <w:t>{</w:t>
+      </w:r>
+      <w:r>
+        <w:rPr>
+          <w:color w:themeColor="text1" w:val="000000"/>
+          <w:shd w:fill="auto" w:val="clear"/>
+        </w:rPr>
+        <w:t>#isOrganization</w:t>
+      </w:r>
+      <w:r>
+        <w:rPr>
+          <w:color w:themeColor="text1" w:val="000000"/>
+          <w:shd w:fill="auto" w:val="clear"/>
+        </w:rPr>
+        <w:t>}</w:t>
       </w:r>
       <w:r>
         <w:rPr>
@@ -70,7 +43,49 @@
           <w:color w:themeColor="text1" w:val="000000"/>
           <w:shd w:fill="auto" w:val="clear"/>
         </w:rPr>
-        <w:t>agentDirectorName</w:t>
+        <w:t>agentName</w:t>
+      </w:r>
+      <w:r>
+        <w:rPr>
+          <w:color w:themeColor="text1" w:val="000000"/>
+          <w:shd w:fill="auto" w:val="clear"/>
+        </w:rPr>
+        <w:t>}{/</w:t>
+      </w:r>
+      <w:r>
+        <w:rPr>
+          <w:color w:themeColor="text1" w:val="000000"/>
+          <w:shd w:fill="auto" w:val="clear"/>
+        </w:rPr>
+        <w:t>isOrganization</w:t>
+      </w:r>
+      <w:r>
+        <w:rPr>
+          <w:color w:themeColor="text1" w:val="000000"/>
+          <w:shd w:fill="auto" w:val="clear"/>
+        </w:rPr>
+        <w:t>}{</w:t>
+      </w:r>
+      <w:r>
+        <w:rPr>
+          <w:color w:themeColor="text1" w:val="000000"/>
+          <w:shd w:fill="auto" w:val="clear"/>
+        </w:rPr>
+        <w:t>#isIndividualEntrepreneur</w:t>
+      </w:r>
+      <w:r>
+        <w:rPr>
+          <w:color w:themeColor="text1" w:val="000000"/>
+          <w:shd w:fill="auto" w:val="clear"/>
+        </w:rPr>
+        <w:t>}{agentDirectorName}{/</w:t>
+      </w:r>
+      <w:r>
+        <w:rPr>
+          <w:color w:themeColor="text1" w:val="000000"/>
+          <w:shd w:fill="auto" w:val="clear"/>
+        </w:rPr>
+        <w:t>isIndividualEntrepreneur</w:t>
       </w:r>
       <w:r>
         <w:rPr>
@@ -96,25 +111,7 @@
           <w:szCs w:val="20"/>
           <w:shd w:fill="auto" w:val="clear"/>
         </w:rPr>
-        <w:t>{</w:t>
-      </w:r>
-      <w:r>
-        <w:rPr>
-          <w:color w:themeColor="text1" w:val="000000"/>
-          <w:sz w:val="20"/>
-          <w:szCs w:val="20"/>
-          <w:shd w:fill="auto" w:val="clear"/>
-        </w:rPr>
-        <w:t>agentAddress</w:t>
-      </w:r>
-      <w:r>
-        <w:rPr>
-          <w:color w:themeColor="text1" w:val="000000"/>
-          <w:sz w:val="20"/>
-          <w:szCs w:val="20"/>
-          <w:shd w:fill="auto" w:val="clear"/>
-        </w:rPr>
-        <w:t>}</w:t>
+        <w:t>{agentAddress}</w:t>
       </w:r>
     </w:p>
     <w:tbl>
@@ -197,139 +194,7 @@
                 <w:shd w:fill="auto" w:val="clear"/>
                 <w:lang w:val="en-US" w:eastAsia="en-US" w:bidi="ar-SA"/>
               </w:rPr>
-              <w:t xml:space="preserve">} </w:t>
-            </w:r>
-            <w:r>
-              <w:rPr>
-                <w:rFonts w:eastAsia="Calibri" w:cs=""/>
-                <w:color w:themeColor="text1" w:val="000000"/>
-                <w:kern w:val="0"/>
-                <w:sz w:val="18"/>
-                <w:szCs w:val="22"/>
-                <w:shd w:fill="auto" w:val="clear"/>
-                <w:lang w:val="en-US" w:eastAsia="en-US" w:bidi="ar-SA"/>
-              </w:rPr>
-              <w:t>{</w:t>
-            </w:r>
-            <w:r>
-              <w:rPr>
-                <w:rFonts w:eastAsia="Calibri" w:cs=""/>
-                <w:color w:themeColor="text1" w:val="000000"/>
-                <w:kern w:val="0"/>
-                <w:sz w:val="18"/>
-                <w:szCs w:val="22"/>
-                <w:shd w:fill="auto" w:val="clear"/>
-                <w:lang w:val="en-US" w:eastAsia="en-US" w:bidi="ar-SA"/>
-              </w:rPr>
-              <w:t>#</w:t>
-            </w:r>
-            <w:r>
-              <w:rPr>
-                <w:rFonts w:eastAsia="Calibri" w:cs=""/>
-                <w:color w:themeColor="text1" w:val="000000"/>
-                <w:kern w:val="0"/>
-                <w:sz w:val="18"/>
-                <w:szCs w:val="22"/>
-                <w:shd w:fill="auto" w:val="clear"/>
-                <w:lang w:val="en-US" w:eastAsia="en-US" w:bidi="ar-SA"/>
-              </w:rPr>
-              <w:t>agentBank</w:t>
-            </w:r>
-            <w:r>
-              <w:rPr>
-                <w:rFonts w:eastAsia="Calibri" w:cs=""/>
-                <w:color w:themeColor="text1" w:val="000000"/>
-                <w:kern w:val="0"/>
-                <w:sz w:val="18"/>
-                <w:szCs w:val="22"/>
-                <w:shd w:fill="auto" w:val="clear"/>
-                <w:lang w:val="en-US" w:eastAsia="en-US" w:bidi="ar-SA"/>
-              </w:rPr>
-              <w:t>City</w:t>
-            </w:r>
-            <w:r>
-              <w:rPr>
-                <w:rFonts w:eastAsia="Calibri" w:cs=""/>
-                <w:color w:themeColor="text1" w:val="000000"/>
-                <w:kern w:val="0"/>
-                <w:sz w:val="18"/>
-                <w:szCs w:val="22"/>
-                <w:shd w:fill="auto" w:val="clear"/>
-                <w:lang w:val="en-US" w:eastAsia="en-US" w:bidi="ar-SA"/>
-              </w:rPr>
-              <w:t>}</w:t>
-            </w:r>
-            <w:r>
-              <w:rPr>
-                <w:rFonts w:eastAsia="Calibri" w:cs=""/>
-                <w:color w:themeColor="text1" w:val="000000"/>
-                <w:kern w:val="0"/>
-                <w:sz w:val="18"/>
-                <w:szCs w:val="22"/>
-                <w:shd w:fill="auto" w:val="clear"/>
-                <w:lang w:val="en-US" w:eastAsia="en-US" w:bidi="ar-SA"/>
-              </w:rPr>
-              <w:t>{agentBank</w:t>
-            </w:r>
-            <w:r>
-              <w:rPr>
-                <w:rFonts w:eastAsia="Calibri" w:cs=""/>
-                <w:color w:themeColor="text1" w:val="000000"/>
-                <w:kern w:val="0"/>
-                <w:sz w:val="18"/>
-                <w:szCs w:val="22"/>
-                <w:shd w:fill="auto" w:val="clear"/>
-                <w:lang w:val="en-US" w:eastAsia="en-US" w:bidi="ar-SA"/>
-              </w:rPr>
-              <w:t>City</w:t>
-            </w:r>
-            <w:r>
-              <w:rPr>
-                <w:rFonts w:eastAsia="Calibri" w:cs=""/>
-                <w:color w:themeColor="text1" w:val="000000"/>
-                <w:kern w:val="0"/>
-                <w:sz w:val="18"/>
-                <w:szCs w:val="22"/>
-                <w:shd w:fill="auto" w:val="clear"/>
-                <w:lang w:val="en-US" w:eastAsia="en-US" w:bidi="ar-SA"/>
-              </w:rPr>
-              <w:t>}</w:t>
-            </w:r>
-            <w:r>
-              <w:rPr>
-                <w:rFonts w:eastAsia="Calibri" w:cs=""/>
-                <w:color w:themeColor="text1" w:val="000000"/>
-                <w:kern w:val="0"/>
-                <w:sz w:val="18"/>
-                <w:szCs w:val="22"/>
-                <w:shd w:fill="auto" w:val="clear"/>
-                <w:lang w:val="en-US" w:eastAsia="en-US" w:bidi="ar-SA"/>
-              </w:rPr>
-              <w:t>{/agentBank</w:t>
-            </w:r>
-            <w:r>
-              <w:rPr>
-                <w:rFonts w:eastAsia="Calibri" w:cs=""/>
-                <w:color w:themeColor="text1" w:val="000000"/>
-                <w:kern w:val="0"/>
-                <w:sz w:val="18"/>
-                <w:szCs w:val="22"/>
-                <w:shd w:fill="auto" w:val="clear"/>
-                <w:lang w:val="en-US" w:eastAsia="en-US" w:bidi="ar-SA"/>
-              </w:rPr>
-              <w:t>City</w:t>
-            </w:r>
-            <w:r>
-              <w:rPr>
-                <w:rFonts w:eastAsia="Calibri" w:cs=""/>
-                <w:color w:themeColor="text1" w:val="000000"/>
-                <w:kern w:val="0"/>
-                <w:sz w:val="18"/>
-                <w:szCs w:val="22"/>
-                <w:shd w:fill="auto" w:val="clear"/>
-                <w:lang w:val="en-US" w:eastAsia="en-US" w:bidi="ar-SA"/>
-              </w:rPr>
-              <w:t>}</w:t>
+              <w:t>} {#agentBankCity}{agentBankCity}{/agentBankCity}</w:t>
             </w:r>
           </w:p>
         </w:tc>
@@ -792,43 +657,7 @@
                 <w:shd w:fill="auto" w:val="clear"/>
                 <w:lang w:val="ru-RU" w:eastAsia="en-US" w:bidi="ar-SA"/>
               </w:rPr>
-              <w:t>{</w:t>
-            </w:r>
-            <w:r>
-              <w:rPr>
-                <w:rFonts w:eastAsia="Calibri" w:cs=""/>
-                <w:color w:themeColor="text1" w:val="000000"/>
-                <w:kern w:val="0"/>
-                <w:sz w:val="18"/>
-                <w:szCs w:val="18"/>
-                <w:shd w:fill="auto" w:val="clear"/>
-                <w:lang w:val="ru-RU" w:eastAsia="en-US" w:bidi="ar-SA"/>
-              </w:rPr>
-              <w:t>#agentKpp</w:t>
-            </w:r>
-            <w:r>
-              <w:rPr>
-                <w:rFonts w:eastAsia="Calibri" w:cs=""/>
-                <w:color w:themeColor="text1" w:val="000000"/>
-                <w:kern w:val="0"/>
-                <w:sz w:val="18"/>
-                <w:szCs w:val="18"/>
-                <w:shd w:fill="auto" w:val="clear"/>
-                <w:lang w:val="ru-RU" w:eastAsia="en-US" w:bidi="ar-SA"/>
-              </w:rPr>
-              <w:t>}</w:t>
-            </w:r>
-            <w:r>
-              <w:rPr>
-                <w:rFonts w:eastAsia="Calibri" w:cs=""/>
-                <w:color w:themeColor="text1" w:val="000000"/>
-                <w:kern w:val="0"/>
-                <w:sz w:val="18"/>
-                <w:szCs w:val="18"/>
-                <w:shd w:fill="auto" w:val="clear"/>
-                <w:lang w:val="ru-RU" w:eastAsia="en-US" w:bidi="ar-SA"/>
-              </w:rPr>
-              <w:t>{agentKpp}{/agentKpp}</w:t>
+              <w:t>{#agentKpp}{agentKpp}{/agentKpp}</w:t>
             </w:r>
           </w:p>
         </w:tc>
@@ -936,26 +765,155 @@
           <w:p>
             <w:pPr>
               <w:pStyle w:val="Normal"/>
-              <w:widowControl/>
-              <w:suppressAutoHyphens w:val="true"/>
-              <w:spacing w:lineRule="auto" w:line="240" w:before="0" w:after="0"/>
-              <w:jc w:val="left"/>
-              <w:rPr>
-                <w:highlight w:val="none"/>
-                <w:shd w:fill="auto" w:val="clear"/>
-              </w:rPr>
-            </w:pPr>
-            <w:r>
-              <w:rPr>
-                <w:rFonts w:eastAsia="Calibri" w:cs=""/>
-                <w:color w:themeColor="text1" w:val="000000"/>
-                <w:kern w:val="0"/>
-                <w:sz w:val="18"/>
-                <w:szCs w:val="22"/>
-                <w:shd w:fill="auto" w:val="clear"/>
-                <w:lang w:val="ru-RU" w:eastAsia="en-US" w:bidi="ar-SA"/>
-              </w:rPr>
-              <w:t>{agentDirectorName}</w:t>
+              <w:spacing w:before="0" w:after="200"/>
+              <w:rPr>
+                <w:highlight w:val="none"/>
+                <w:shd w:fill="auto" w:val="clear"/>
+              </w:rPr>
+            </w:pPr>
+            <w:r>
+              <w:rPr>
+                <w:rFonts w:eastAsia="Calibri" w:cs=""/>
+                <w:color w:themeColor="text1" w:val="000000"/>
+                <w:kern w:val="0"/>
+                <w:sz w:val="18"/>
+                <w:szCs w:val="22"/>
+                <w:shd w:fill="auto" w:val="clear"/>
+                <w:lang w:val="ru-RU" w:eastAsia="en-US" w:bidi="ar-SA"/>
+              </w:rPr>
+              <w:t>{</w:t>
+            </w:r>
+            <w:r>
+              <w:rPr>
+                <w:rFonts w:eastAsia="Calibri" w:cs=""/>
+                <w:color w:themeColor="text1" w:val="000000"/>
+                <w:kern w:val="0"/>
+                <w:sz w:val="18"/>
+                <w:szCs w:val="22"/>
+                <w:shd w:fill="auto" w:val="clear"/>
+                <w:lang w:val="ru-RU" w:eastAsia="en-US" w:bidi="ar-SA"/>
+              </w:rPr>
+              <w:t>#isOrganization</w:t>
+            </w:r>
+            <w:r>
+              <w:rPr>
+                <w:rFonts w:eastAsia="Calibri" w:cs=""/>
+                <w:color w:themeColor="text1" w:val="000000"/>
+                <w:kern w:val="0"/>
+                <w:sz w:val="18"/>
+                <w:szCs w:val="22"/>
+                <w:shd w:fill="auto" w:val="clear"/>
+                <w:lang w:val="ru-RU" w:eastAsia="en-US" w:bidi="ar-SA"/>
+              </w:rPr>
+              <w:t>}</w:t>
+            </w:r>
+            <w:r>
+              <w:rPr>
+                <w:rFonts w:eastAsia="Calibri" w:cs=""/>
+                <w:color w:themeColor="text1" w:val="000000"/>
+                <w:kern w:val="0"/>
+                <w:sz w:val="18"/>
+                <w:szCs w:val="22"/>
+                <w:shd w:fill="auto" w:val="clear"/>
+                <w:lang w:val="ru-RU" w:eastAsia="en-US" w:bidi="ar-SA"/>
+              </w:rPr>
+              <w:t>{</w:t>
+            </w:r>
+            <w:r>
+              <w:rPr>
+                <w:rFonts w:eastAsia="Calibri" w:cs=""/>
+                <w:color w:themeColor="text1" w:val="000000"/>
+                <w:kern w:val="0"/>
+                <w:sz w:val="18"/>
+                <w:szCs w:val="22"/>
+                <w:shd w:fill="auto" w:val="clear"/>
+                <w:lang w:val="ru-RU" w:eastAsia="en-US" w:bidi="ar-SA"/>
+              </w:rPr>
+              <w:t>agentName</w:t>
+            </w:r>
+            <w:r>
+              <w:rPr>
+                <w:rFonts w:eastAsia="Calibri" w:cs=""/>
+                <w:color w:themeColor="text1" w:val="000000"/>
+                <w:kern w:val="0"/>
+                <w:sz w:val="18"/>
+                <w:szCs w:val="22"/>
+                <w:shd w:fill="auto" w:val="clear"/>
+                <w:lang w:val="ru-RU" w:eastAsia="en-US" w:bidi="ar-SA"/>
+              </w:rPr>
+              <w:t>}{/</w:t>
+            </w:r>
+            <w:r>
+              <w:rPr>
+                <w:rFonts w:eastAsia="Calibri" w:cs=""/>
+                <w:color w:themeColor="text1" w:val="000000"/>
+                <w:kern w:val="0"/>
+                <w:sz w:val="18"/>
+                <w:szCs w:val="22"/>
+                <w:shd w:fill="auto" w:val="clear"/>
+                <w:lang w:val="ru-RU" w:eastAsia="en-US" w:bidi="ar-SA"/>
+              </w:rPr>
+              <w:t>isOrganization</w:t>
+            </w:r>
+            <w:r>
+              <w:rPr>
+                <w:rFonts w:eastAsia="Calibri" w:cs=""/>
+                <w:color w:themeColor="text1" w:val="000000"/>
+                <w:kern w:val="0"/>
+                <w:sz w:val="18"/>
+                <w:szCs w:val="22"/>
+                <w:shd w:fill="auto" w:val="clear"/>
+                <w:lang w:val="ru-RU" w:eastAsia="en-US" w:bidi="ar-SA"/>
+              </w:rPr>
+              <w:t>}{</w:t>
+            </w:r>
+            <w:r>
+              <w:rPr>
+                <w:rFonts w:eastAsia="Calibri" w:cs=""/>
+                <w:color w:themeColor="text1" w:val="000000"/>
+                <w:kern w:val="0"/>
+                <w:sz w:val="18"/>
+                <w:szCs w:val="22"/>
+                <w:shd w:fill="auto" w:val="clear"/>
+                <w:lang w:val="ru-RU" w:eastAsia="en-US" w:bidi="ar-SA"/>
+              </w:rPr>
+              <w:t>#isIndividualEntrepreneur</w:t>
+            </w:r>
+            <w:r>
+              <w:rPr>
+                <w:rFonts w:eastAsia="Calibri" w:cs=""/>
+                <w:color w:themeColor="text1" w:val="000000"/>
+                <w:kern w:val="0"/>
+                <w:sz w:val="18"/>
+                <w:szCs w:val="22"/>
+                <w:shd w:fill="auto" w:val="clear"/>
+                <w:lang w:val="ru-RU" w:eastAsia="en-US" w:bidi="ar-SA"/>
+              </w:rPr>
+              <w:t>}{agentDirectorName}{/</w:t>
+            </w:r>
+            <w:r>
+              <w:rPr>
+                <w:rFonts w:eastAsia="Calibri" w:cs=""/>
+                <w:color w:themeColor="text1" w:val="000000"/>
+                <w:kern w:val="0"/>
+                <w:sz w:val="18"/>
+                <w:szCs w:val="22"/>
+                <w:shd w:fill="auto" w:val="clear"/>
+                <w:lang w:val="ru-RU" w:eastAsia="en-US" w:bidi="ar-SA"/>
+              </w:rPr>
+              <w:t>isIndividualEntrepreneur</w:t>
+            </w:r>
+            <w:r>
+              <w:rPr>
+                <w:rFonts w:eastAsia="Calibri" w:cs=""/>
+                <w:color w:themeColor="text1" w:val="000000"/>
+                <w:kern w:val="0"/>
+                <w:sz w:val="18"/>
+                <w:szCs w:val="22"/>
+                <w:shd w:fill="auto" w:val="clear"/>
+                <w:lang w:val="ru-RU" w:eastAsia="en-US" w:bidi="ar-SA"/>
+              </w:rPr>
+              <w:t>}</w:t>
             </w:r>
           </w:p>
         </w:tc>
@@ -1155,77 +1113,7 @@
           <w:szCs w:val="29"/>
           <w:shd w:fill="auto" w:val="clear"/>
         </w:rPr>
-        <w:t xml:space="preserve">Счёт № </w:t>
-      </w:r>
-      <w:r>
-        <w:rPr>
-          <w:b/>
-          <w:color w:themeColor="text1" w:val="000000"/>
-          <w:sz w:val="29"/>
-          <w:szCs w:val="29"/>
-          <w:shd w:fill="auto" w:val="clear"/>
-        </w:rPr>
-        <w:t>{</w:t>
-      </w:r>
-      <w:r>
-        <w:rPr>
-          <w:b/>
-          <w:color w:themeColor="text1" w:val="000000"/>
-          <w:sz w:val="29"/>
-          <w:szCs w:val="29"/>
-          <w:shd w:fill="auto" w:val="clear"/>
-        </w:rPr>
-        <w:t>invoiceNumber</w:t>
-      </w:r>
-      <w:r>
-        <w:rPr>
-          <w:b/>
-          <w:color w:themeColor="text1" w:val="000000"/>
-          <w:sz w:val="29"/>
-          <w:szCs w:val="29"/>
-          <w:shd w:fill="auto" w:val="clear"/>
-        </w:rPr>
-        <w:t>}</w:t>
-      </w:r>
-      <w:r>
-        <w:rPr>
-          <w:b/>
-          <w:color w:themeColor="text1" w:val="000000"/>
-          <w:sz w:val="29"/>
-          <w:szCs w:val="29"/>
-          <w:shd w:fill="auto" w:val="clear"/>
-        </w:rPr>
-        <w:t xml:space="preserve"> от </w:t>
-      </w:r>
-      <w:r>
-        <w:rPr>
-          <w:b/>
-          <w:color w:themeColor="text1" w:val="000000"/>
-          <w:sz w:val="29"/>
-          <w:szCs w:val="29"/>
-          <w:shd w:fill="auto" w:val="clear"/>
-        </w:rPr>
-        <w:t>{</w:t>
-      </w:r>
-      <w:r>
-        <w:rPr>
-          <w:b/>
-          <w:color w:themeColor="text1" w:val="000000"/>
-          <w:sz w:val="29"/>
-          <w:szCs w:val="29"/>
-          <w:shd w:fill="auto" w:val="clear"/>
-        </w:rPr>
-        <w:t>date</w:t>
-      </w:r>
-      <w:r>
-        <w:rPr>
-          <w:b/>
-          <w:color w:themeColor="text1" w:val="000000"/>
-          <w:sz w:val="29"/>
-          <w:szCs w:val="29"/>
-          <w:shd w:fill="auto" w:val="clear"/>
-        </w:rPr>
-        <w:t>}</w:t>
+        <w:t>Счёт № {invoiceNumber} от {date}</w:t>
       </w:r>
     </w:p>
     <w:tbl>
@@ -1313,11 +1201,35 @@
                 <w:color w:themeColor="text1" w:val="000000"/>
                 <w:kern w:val="0"/>
                 <w:sz w:val="18"/>
-                <w:szCs w:val="18"/>
-                <w:shd w:fill="auto" w:val="clear"/>
-                <w:lang w:val="ru-RU" w:eastAsia="en-US" w:bidi="ar-SA"/>
-              </w:rPr>
-              <w:t>{ФИОИП}</w:t>
+                <w:szCs w:val="22"/>
+                <w:shd w:fill="auto" w:val="clear"/>
+                <w:lang w:val="en-US" w:eastAsia="en-US" w:bidi="ar-SA"/>
+              </w:rPr>
+              <w:t>{</w:t>
+            </w:r>
+            <w:r>
+              <w:rPr>
+                <w:rFonts w:eastAsia="Calibri" w:cs=""/>
+                <w:color w:themeColor="text1" w:val="000000"/>
+                <w:kern w:val="0"/>
+                <w:sz w:val="18"/>
+                <w:szCs w:val="22"/>
+                <w:shd w:fill="auto" w:val="clear"/>
+                <w:lang w:val="ru-RU" w:eastAsia="en-US" w:bidi="ar-SA"/>
+              </w:rPr>
+              <w:t>agentBankName</w:t>
+            </w:r>
+            <w:r>
+              <w:rPr>
+                <w:rFonts w:eastAsia="Calibri" w:cs=""/>
+                <w:color w:themeColor="text1" w:val="000000"/>
+                <w:kern w:val="0"/>
+                <w:sz w:val="18"/>
+                <w:szCs w:val="22"/>
+                <w:shd w:fill="auto" w:val="clear"/>
+                <w:lang w:val="en-US" w:eastAsia="en-US" w:bidi="ar-SA"/>
+              </w:rPr>
+              <w:t>} {#agentBankCity}{agentBankCity}{/agentBankCity}</w:t>
             </w:r>
           </w:p>
         </w:tc>
@@ -1406,7 +1318,7 @@
                 <w:shd w:fill="auto" w:val="clear"/>
                 <w:lang w:val="ru-RU" w:eastAsia="en-US" w:bidi="ar-SA"/>
               </w:rPr>
-              <w:t>{НазваниеКонтр}</w:t>
+              <w:t>{</w:t>
             </w:r>
             <w:r>
               <w:rPr>
@@ -1418,7 +1330,7 @@
                 <w:shd w:fill="auto" w:val="clear"/>
                 <w:lang w:val="ru-RU" w:eastAsia="en-US" w:bidi="ar-SA"/>
               </w:rPr>
-              <w:t xml:space="preserve">, </w:t>
+              <w:t>orgName</w:t>
             </w:r>
             <w:r>
               <w:rPr>
@@ -1430,55 +1342,7 @@
                 <w:shd w:fill="auto" w:val="clear"/>
                 <w:lang w:val="ru-RU" w:eastAsia="en-US" w:bidi="ar-SA"/>
               </w:rPr>
-              <w:t>{</w:t>
-            </w:r>
-            <w:r>
-              <w:rPr>
-                <w:rFonts w:eastAsia="Calibri" w:cs=""/>
-                <w:color w:themeColor="text1" w:val="000000"/>
-                <w:kern w:val="0"/>
-                <w:sz w:val="18"/>
-                <w:szCs w:val="18"/>
-                <w:shd w:fill="auto" w:val="clear"/>
-                <w:lang w:val="ru-RU" w:eastAsia="en-US" w:bidi="ar-SA"/>
-              </w:rPr>
-              <w:t>inn</w:t>
-            </w:r>
-            <w:r>
-              <w:rPr>
-                <w:rFonts w:eastAsia="Calibri" w:cs=""/>
-                <w:color w:themeColor="text1" w:val="000000"/>
-                <w:kern w:val="0"/>
-                <w:sz w:val="18"/>
-                <w:szCs w:val="18"/>
-                <w:shd w:fill="auto" w:val="clear"/>
-                <w:lang w:val="ru-RU" w:eastAsia="en-US" w:bidi="ar-SA"/>
-              </w:rPr>
-              <w:t>}</w:t>
-            </w:r>
-            <w:r>
-              <w:rPr>
-                <w:rFonts w:eastAsia="Calibri" w:cs=""/>
-                <w:color w:themeColor="text1" w:val="000000"/>
-                <w:kern w:val="0"/>
-                <w:sz w:val="18"/>
-                <w:szCs w:val="18"/>
-                <w:shd w:fill="auto" w:val="clear"/>
-                <w:lang w:val="ru-RU" w:eastAsia="en-US" w:bidi="ar-SA"/>
-              </w:rPr>
-              <w:t xml:space="preserve">, </w:t>
-            </w:r>
-            <w:r>
-              <w:rPr>
-                <w:rFonts w:eastAsia="Calibri" w:cs=""/>
-                <w:color w:themeColor="text1" w:val="000000"/>
-                <w:kern w:val="0"/>
-                <w:sz w:val="18"/>
-                <w:szCs w:val="18"/>
-                <w:shd w:fill="auto" w:val="clear"/>
-                <w:lang w:val="ru-RU" w:eastAsia="en-US" w:bidi="ar-SA"/>
-              </w:rPr>
-              <w:t>{clientKpp}</w:t>
+              <w:t>}, {inn}, {clientKpp}</w:t>
             </w:r>
           </w:p>
         </w:tc>
@@ -1494,7 +1358,8 @@
       </w:pPr>
       <w:r>
         <w:rPr>
-          <w:shd w:fill="auto" w:val="clear"/>
+          <w:color w:themeColor="text1" w:val="000000"/>
+          <w:szCs w:val="18"/>
         </w:rPr>
       </w:r>
     </w:p>
@@ -1516,43 +1381,7 @@
           <w:szCs w:val="20"/>
           <w:shd w:fill="auto" w:val="clear"/>
         </w:rPr>
-        <w:t xml:space="preserve">Всего к оплате: </w:t>
-      </w:r>
-      <w:r>
-        <w:rPr>
-          <w:color w:themeColor="text1" w:val="000000"/>
-          <w:sz w:val="20"/>
-          <w:szCs w:val="20"/>
-          <w:shd w:fill="auto" w:val="clear"/>
-        </w:rPr>
-        <w:t>{</w:t>
-      </w:r>
-      <w:r>
-        <w:rPr>
-          <w:color w:themeColor="text1" w:val="000000"/>
-          <w:sz w:val="20"/>
-          <w:szCs w:val="20"/>
-          <w:shd w:fill="auto" w:val="clear"/>
-        </w:rPr>
-        <w:t>totalBaseInWords</w:t>
-      </w:r>
-      <w:r>
-        <w:rPr>
-          <w:color w:themeColor="text1" w:val="000000"/>
-          <w:sz w:val="20"/>
-          <w:szCs w:val="20"/>
-          <w:shd w:fill="auto" w:val="clear"/>
-        </w:rPr>
-        <w:t>}</w:t>
-      </w:r>
-      <w:r>
-        <w:rPr>
-          <w:color w:themeColor="text1" w:val="000000"/>
-          <w:sz w:val="20"/>
-          <w:szCs w:val="20"/>
-          <w:shd w:fill="auto" w:val="clear"/>
-        </w:rPr>
-        <w:t>.</w:t>
+        <w:t>Всего к оплате: {totalBaseInWords}.</w:t>
       </w:r>
     </w:p>
     <w:p>
@@ -1566,16 +1395,14 @@
         </w:rPr>
       </w:pPr>
       <w:r>
-        <w:rPr>
-          <w:shd w:fill="auto" w:val="clear"/>
-        </w:rPr>
+        <w:rPr/>
         <mc:AlternateContent>
           <mc:Choice Requires="wps">
             <w:drawing>
               <wp:inline distT="0" distB="0" distL="0" distR="0">
                 <wp:extent cx="6652895" cy="20320"/>
                 <wp:effectExtent l="0" t="0" r="0" b="0"/>
-                <wp:docPr id="2" name="Shape1"/>
+                <wp:docPr id="1" name="Shape1"/>
                 <a:graphic xmlns:a="http://schemas.openxmlformats.org/drawingml/2006/main">
                   <a:graphicData uri="http://schemas.microsoft.com/office/word/2010/wordprocessingShape">
                     <wps:wsp>
@@ -1632,7 +1459,7 @@
       </w:r>
       <w:r>
         <w:drawing>
-          <wp:anchor distT="0" distB="0" distL="0" distR="0" simplePos="0" relativeHeight="4" behindDoc="0" locked="0" layoutInCell="1" allowOverlap="1">
+          <wp:anchor distT="0" distB="0" distL="0" distR="0" simplePos="0" relativeHeight="3" behindDoc="0" locked="0" layoutInCell="1" allowOverlap="1">
             <wp:simplePos x="0" y="0"/>
             <wp:positionH relativeFrom="column">
               <wp:posOffset>1974850</wp:posOffset>
@@ -1643,7 +1470,7 @@
             <wp:extent cx="1661795" cy="1661795"/>
             <wp:effectExtent l="0" t="0" r="0" b="0"/>
             <wp:wrapNone/>
-            <wp:docPr id="3" name="Рисунок 7" descr="{stamp}"/>
+            <wp:docPr id="2" name="Рисунок 7" descr="{stamp}"/>
             <wp:cNvGraphicFramePr>
               <a:graphicFrameLocks xmlns:a="http://schemas.openxmlformats.org/drawingml/2006/main" noChangeAspect="1"/>
             </wp:cNvGraphicFramePr>
@@ -1651,13 +1478,13 @@
               <a:graphicData uri="http://schemas.openxmlformats.org/drawingml/2006/picture">
                 <pic:pic xmlns:pic="http://schemas.openxmlformats.org/drawingml/2006/picture">
                   <pic:nvPicPr>
-                    <pic:cNvPr id="3" name="Рисунок 7" descr="{stamp}"/>
+                    <pic:cNvPr id="2" name="Рисунок 7" descr="{stamp}"/>
                     <pic:cNvPicPr>
                       <a:picLocks noChangeAspect="1" noChangeArrowheads="1"/>
                     </pic:cNvPicPr>
                   </pic:nvPicPr>
                   <pic:blipFill>
-                    <a:blip r:embed="rId3"/>
+                    <a:blip r:embed="rId2"/>
                     <a:stretch>
                       <a:fillRect/>
                     </a:stretch>
@@ -1686,37 +1513,7 @@
         </w:rPr>
         <w:br/>
         <w:br/>
-      </w:r>
-      <w:r>
-        <w:rPr>
-          <w:color w:themeColor="text1" w:val="000000"/>
-          <w:szCs w:val="18"/>
-          <w:shd w:fill="auto" w:val="clear"/>
-        </w:rPr>
-        <w:t>{</w:t>
-      </w:r>
-      <w:r>
-        <w:rPr>
-          <w:color w:themeColor="text1" w:val="000000"/>
-          <w:szCs w:val="18"/>
-          <w:shd w:fill="auto" w:val="clear"/>
-        </w:rPr>
-        <w:t>memo</w:t>
-      </w:r>
-      <w:r>
-        <w:rPr>
-          <w:color w:themeColor="text1" w:val="000000"/>
-          <w:szCs w:val="18"/>
-          <w:shd w:fill="auto" w:val="clear"/>
-        </w:rPr>
-        <w:t>}</w:t>
-      </w:r>
-      <w:r>
-        <w:rPr>
-          <w:color w:themeColor="text1" w:val="000000"/>
-          <w:szCs w:val="18"/>
-          <w:shd w:fill="auto" w:val="clear"/>
-        </w:rPr>
+        <w:t>{memo}</w:t>
         <w:br/>
         <w:t xml:space="preserve"> </w:t>
       </w:r>
@@ -1738,10 +1535,10 @@
       </w:tblPr>
       <w:tblGrid>
         <w:gridCol w:w="1384"/>
-        <w:gridCol w:w="4251"/>
+        <w:gridCol w:w="4250"/>
         <w:gridCol w:w="2409"/>
         <w:gridCol w:w="284"/>
-        <w:gridCol w:w="2354"/>
+        <w:gridCol w:w="2355"/>
       </w:tblGrid>
       <w:tr>
         <w:trPr/>
@@ -1785,7 +1582,7 @@
         </w:tc>
         <w:tc>
           <w:tcPr>
-            <w:tcW w:w="4251" w:type="dxa"/>
+            <w:tcW w:w="4250" w:type="dxa"/>
             <w:tcBorders>
               <w:top w:val="nil"/>
               <w:left w:val="nil"/>
@@ -1811,7 +1608,7 @@
             </w:pPr>
             <w:r>
               <w:drawing>
-                <wp:anchor distT="0" distB="0" distL="0" distR="0" simplePos="0" relativeHeight="5" behindDoc="0" locked="0" layoutInCell="1" allowOverlap="1">
+                <wp:anchor distT="0" distB="0" distL="0" distR="0" simplePos="0" relativeHeight="4" behindDoc="0" locked="0" layoutInCell="1" allowOverlap="1">
                   <wp:simplePos x="0" y="0"/>
                   <wp:positionH relativeFrom="column">
                     <wp:posOffset>2832735</wp:posOffset>
@@ -1822,7 +1619,7 @@
                   <wp:extent cx="1038860" cy="1192530"/>
                   <wp:effectExtent l="0" t="0" r="0" b="0"/>
                   <wp:wrapNone/>
-                  <wp:docPr id="4" name="Рисунок 8" descr="{signature}"/>
+                  <wp:docPr id="3" name="Рисунок 8" descr="{signature}"/>
                   <wp:cNvGraphicFramePr>
                     <a:graphicFrameLocks xmlns:a="http://schemas.openxmlformats.org/drawingml/2006/main" noChangeAspect="1"/>
                   </wp:cNvGraphicFramePr>
@@ -1830,13 +1627,13 @@
                     <a:graphicData uri="http://schemas.openxmlformats.org/drawingml/2006/picture">
                       <pic:pic xmlns:pic="http://schemas.openxmlformats.org/drawingml/2006/picture">
                         <pic:nvPicPr>
-                          <pic:cNvPr id="4" name="Рисунок 8" descr="{signature}"/>
+                          <pic:cNvPr id="3" name="Рисунок 8" descr="{signature}"/>
                           <pic:cNvPicPr>
                             <a:picLocks noChangeAspect="1" noChangeArrowheads="1"/>
                           </pic:cNvPicPr>
                         </pic:nvPicPr>
                         <pic:blipFill>
-                          <a:blip r:embed="rId4"/>
+                          <a:blip r:embed="rId3"/>
                           <a:stretch>
                             <a:fillRect/>
                           </a:stretch>
@@ -1867,7 +1664,31 @@
                 <w:shd w:fill="auto" w:val="clear"/>
                 <w:lang w:val="ru-RU" w:eastAsia="en-US" w:bidi="ar-SA"/>
               </w:rPr>
-              <w:t>Индивидуальный предприниматель</w:t>
+              <w:t>{agent</w:t>
+            </w:r>
+            <w:r>
+              <w:rPr>
+                <w:rFonts w:eastAsia="Calibri" w:cs=""/>
+                <w:color w:themeColor="text1" w:val="000000"/>
+                <w:kern w:val="0"/>
+                <w:sz w:val="18"/>
+                <w:szCs w:val="22"/>
+                <w:shd w:fill="auto" w:val="clear"/>
+                <w:lang w:val="ru-RU" w:eastAsia="en-US" w:bidi="ar-SA"/>
+              </w:rPr>
+              <w:t>Director</w:t>
+            </w:r>
+            <w:r>
+              <w:rPr>
+                <w:rFonts w:eastAsia="Calibri" w:cs=""/>
+                <w:color w:themeColor="text1" w:val="000000"/>
+                <w:kern w:val="0"/>
+                <w:sz w:val="18"/>
+                <w:szCs w:val="22"/>
+                <w:shd w:fill="auto" w:val="clear"/>
+                <w:lang w:val="ru-RU" w:eastAsia="en-US" w:bidi="ar-SA"/>
+              </w:rPr>
+              <w:t>Basis}</w:t>
             </w:r>
           </w:p>
         </w:tc>
@@ -1942,7 +1763,7 @@
         </w:tc>
         <w:tc>
           <w:tcPr>
-            <w:tcW w:w="2354" w:type="dxa"/>
+            <w:tcW w:w="2355" w:type="dxa"/>
             <w:tcBorders>
               <w:top w:val="nil"/>
               <w:left w:val="nil"/>
@@ -2046,7 +1867,7 @@
         </w:tc>
         <w:tc>
           <w:tcPr>
-            <w:tcW w:w="4251" w:type="dxa"/>
+            <w:tcW w:w="4250" w:type="dxa"/>
             <w:tcBorders>
               <w:left w:val="nil"/>
               <w:bottom w:val="nil"/>
@@ -2155,7 +1976,7 @@
         </w:tc>
         <w:tc>
           <w:tcPr>
-            <w:tcW w:w="2354" w:type="dxa"/>
+            <w:tcW w:w="2355" w:type="dxa"/>
             <w:tcBorders>
               <w:left w:val="nil"/>
               <w:bottom w:val="nil"/>
@@ -2216,9 +2037,9 @@
       </w:r>
     </w:p>
     <w:sectPr>
-      <w:footerReference w:type="even" r:id="rId5"/>
-      <w:footerReference w:type="default" r:id="rId6"/>
-      <w:footerReference w:type="first" r:id="rId7"/>
+      <w:footerReference w:type="even" r:id="rId4"/>
+      <w:footerReference w:type="default" r:id="rId5"/>
+      <w:footerReference w:type="first" r:id="rId6"/>
       <w:type w:val="nextPage"/>
       <w:pgSz w:w="11906" w:h="16838"/>
       <w:pgMar w:left="709" w:right="720" w:gutter="0" w:header="0" w:top="720" w:footer="227" w:bottom="720"/>

</xml_diff>

<commit_message>
feat(document-generation): add ГОСТ Р 56042-2014 QR code for RU invoices
Generate a payment QR code per ГОСТ Р 56042-2014 (ST00012, UTF-8) and
inject it into the {qr} image placeholder of ru_invoice.docx so customers
can pay by scanning the invoice in Sber/T-Bank/Alfa/VTB apps. Eligibility
gate (lang=ru, currency=RUB, valid BIC/account/correspondent/INN) keeps
non-RU and non-RUB flows on a transparent 1×1 fallback PNG sized to the
placeholder, so the document layout stays stable when QR is not applicable.

Co-Authored-By: Claude Opus 4.7 (1M context) <noreply@anthropic.com>
</commit_message>
<xml_diff>
--- a/packages/workflows/document-generation/templates/ru_invoice.docx
+++ b/packages/workflows/document-generation/templates/ru_invoice.docx
@@ -11,88 +11,59 @@
         </w:rPr>
       </w:pPr>
       <w:r>
-        <w:rPr>
-          <w:color w:themeColor="text1" w:val="000000"/>
-          <w:shd w:fill="auto" w:val="clear"/>
-        </w:rPr>
-        <w:t>{</w:t>
+        <w:drawing>
+          <wp:anchor distT="0" distB="179705" distL="114300" distR="114300" simplePos="0" relativeHeight="5" behindDoc="0" locked="0" layoutInCell="0" allowOverlap="1">
+            <wp:simplePos x="0" y="0"/>
+            <wp:positionH relativeFrom="column">
+              <wp:posOffset>5385435</wp:posOffset>
+            </wp:positionH>
+            <wp:positionV relativeFrom="paragraph">
+              <wp:posOffset>-43180</wp:posOffset>
+            </wp:positionV>
+            <wp:extent cx="1627505" cy="1627505"/>
+            <wp:effectExtent l="0" t="0" r="0" b="0"/>
+            <wp:wrapSquare wrapText="bothSides"/>
+            <wp:docPr id="1" name="Рисунок 6" descr="{qr}"/>
+            <wp:cNvGraphicFramePr>
+              <a:graphicFrameLocks xmlns:a="http://schemas.openxmlformats.org/drawingml/2006/main" noChangeAspect="1"/>
+            </wp:cNvGraphicFramePr>
+            <a:graphic xmlns:a="http://schemas.openxmlformats.org/drawingml/2006/main">
+              <a:graphicData uri="http://schemas.openxmlformats.org/drawingml/2006/picture">
+                <pic:pic xmlns:pic="http://schemas.openxmlformats.org/drawingml/2006/picture">
+                  <pic:nvPicPr>
+                    <pic:cNvPr id="1" name="Рисунок 6" descr="{qr}"/>
+                    <pic:cNvPicPr>
+                      <a:picLocks noChangeAspect="1" noChangeArrowheads="1"/>
+                    </pic:cNvPicPr>
+                  </pic:nvPicPr>
+                  <pic:blipFill>
+                    <a:blip r:embed="rId2"/>
+                    <a:stretch>
+                      <a:fillRect/>
+                    </a:stretch>
+                  </pic:blipFill>
+                  <pic:spPr bwMode="auto">
+                    <a:xfrm>
+                      <a:off x="0" y="0"/>
+                      <a:ext cx="1627505" cy="1627505"/>
+                    </a:xfrm>
+                    <a:prstGeom prst="rect">
+                      <a:avLst/>
+                    </a:prstGeom>
+                    <a:noFill/>
+                  </pic:spPr>
+                </pic:pic>
+              </a:graphicData>
+            </a:graphic>
+          </wp:anchor>
+        </w:drawing>
       </w:r>
       <w:r>
         <w:rPr>
           <w:color w:themeColor="text1" w:val="000000"/>
           <w:shd w:fill="auto" w:val="clear"/>
         </w:rPr>
-        <w:t>#isOrganization</w:t>
-      </w:r>
-      <w:r>
-        <w:rPr>
-          <w:color w:themeColor="text1" w:val="000000"/>
-          <w:shd w:fill="auto" w:val="clear"/>
-        </w:rPr>
-        <w:t>}</w:t>
-      </w:r>
-      <w:r>
-        <w:rPr>
-          <w:color w:themeColor="text1" w:val="000000"/>
-          <w:shd w:fill="auto" w:val="clear"/>
-        </w:rPr>
-        <w:t>{</w:t>
-      </w:r>
-      <w:r>
-        <w:rPr>
-          <w:color w:themeColor="text1" w:val="000000"/>
-          <w:shd w:fill="auto" w:val="clear"/>
-        </w:rPr>
-        <w:t>agentName</w:t>
-      </w:r>
-      <w:r>
-        <w:rPr>
-          <w:color w:themeColor="text1" w:val="000000"/>
-          <w:shd w:fill="auto" w:val="clear"/>
-        </w:rPr>
-        <w:t>}{/</w:t>
-      </w:r>
-      <w:r>
-        <w:rPr>
-          <w:color w:themeColor="text1" w:val="000000"/>
-          <w:shd w:fill="auto" w:val="clear"/>
-        </w:rPr>
-        <w:t>isOrganization</w:t>
-      </w:r>
-      <w:r>
-        <w:rPr>
-          <w:color w:themeColor="text1" w:val="000000"/>
-          <w:shd w:fill="auto" w:val="clear"/>
-        </w:rPr>
-        <w:t>}{</w:t>
-      </w:r>
-      <w:r>
-        <w:rPr>
-          <w:color w:themeColor="text1" w:val="000000"/>
-          <w:shd w:fill="auto" w:val="clear"/>
-        </w:rPr>
-        <w:t>#isIndividualEntrepreneur</w:t>
-      </w:r>
-      <w:r>
-        <w:rPr>
-          <w:color w:themeColor="text1" w:val="000000"/>
-          <w:shd w:fill="auto" w:val="clear"/>
-        </w:rPr>
-        <w:t>}{agentDirectorName}{/</w:t>
-      </w:r>
-      <w:r>
-        <w:rPr>
-          <w:color w:themeColor="text1" w:val="000000"/>
-          <w:shd w:fill="auto" w:val="clear"/>
-        </w:rPr>
-        <w:t>isIndividualEntrepreneur</w:t>
-      </w:r>
-      <w:r>
-        <w:rPr>
-          <w:color w:themeColor="text1" w:val="000000"/>
-          <w:shd w:fill="auto" w:val="clear"/>
-        </w:rPr>
-        <w:t>}</w:t>
+        <w:t>{#isOrganization}{agentName}{/isOrganization}{#isIndividualEntrepreneur}{agentDirectorName}{/isIndividualEntrepreneur}</w:t>
       </w:r>
     </w:p>
     <w:p>
@@ -766,6 +737,7 @@
             <w:pPr>
               <w:pStyle w:val="Normal"/>
               <w:spacing w:before="0" w:after="200"/>
+              <w:jc w:val="left"/>
               <w:rPr>
                 <w:highlight w:val="none"/>
                 <w:shd w:fill="auto" w:val="clear"/>
@@ -781,139 +753,7 @@
                 <w:shd w:fill="auto" w:val="clear"/>
                 <w:lang w:val="ru-RU" w:eastAsia="en-US" w:bidi="ar-SA"/>
               </w:rPr>
-              <w:t>{</w:t>
-            </w:r>
-            <w:r>
-              <w:rPr>
-                <w:rFonts w:eastAsia="Calibri" w:cs=""/>
-                <w:color w:themeColor="text1" w:val="000000"/>
-                <w:kern w:val="0"/>
-                <w:sz w:val="18"/>
-                <w:szCs w:val="22"/>
-                <w:shd w:fill="auto" w:val="clear"/>
-                <w:lang w:val="ru-RU" w:eastAsia="en-US" w:bidi="ar-SA"/>
-              </w:rPr>
-              <w:t>#isOrganization</w:t>
-            </w:r>
-            <w:r>
-              <w:rPr>
-                <w:rFonts w:eastAsia="Calibri" w:cs=""/>
-                <w:color w:themeColor="text1" w:val="000000"/>
-                <w:kern w:val="0"/>
-                <w:sz w:val="18"/>
-                <w:szCs w:val="22"/>
-                <w:shd w:fill="auto" w:val="clear"/>
-                <w:lang w:val="ru-RU" w:eastAsia="en-US" w:bidi="ar-SA"/>
-              </w:rPr>
-              <w:t>}</w:t>
-            </w:r>
-            <w:r>
-              <w:rPr>
-                <w:rFonts w:eastAsia="Calibri" w:cs=""/>
-                <w:color w:themeColor="text1" w:val="000000"/>
-                <w:kern w:val="0"/>
-                <w:sz w:val="18"/>
-                <w:szCs w:val="22"/>
-                <w:shd w:fill="auto" w:val="clear"/>
-                <w:lang w:val="ru-RU" w:eastAsia="en-US" w:bidi="ar-SA"/>
-              </w:rPr>
-              <w:t>{</w:t>
-            </w:r>
-            <w:r>
-              <w:rPr>
-                <w:rFonts w:eastAsia="Calibri" w:cs=""/>
-                <w:color w:themeColor="text1" w:val="000000"/>
-                <w:kern w:val="0"/>
-                <w:sz w:val="18"/>
-                <w:szCs w:val="22"/>
-                <w:shd w:fill="auto" w:val="clear"/>
-                <w:lang w:val="ru-RU" w:eastAsia="en-US" w:bidi="ar-SA"/>
-              </w:rPr>
-              <w:t>agentName</w:t>
-            </w:r>
-            <w:r>
-              <w:rPr>
-                <w:rFonts w:eastAsia="Calibri" w:cs=""/>
-                <w:color w:themeColor="text1" w:val="000000"/>
-                <w:kern w:val="0"/>
-                <w:sz w:val="18"/>
-                <w:szCs w:val="22"/>
-                <w:shd w:fill="auto" w:val="clear"/>
-                <w:lang w:val="ru-RU" w:eastAsia="en-US" w:bidi="ar-SA"/>
-              </w:rPr>
-              <w:t>}{/</w:t>
-            </w:r>
-            <w:r>
-              <w:rPr>
-                <w:rFonts w:eastAsia="Calibri" w:cs=""/>
-                <w:color w:themeColor="text1" w:val="000000"/>
-                <w:kern w:val="0"/>
-                <w:sz w:val="18"/>
-                <w:szCs w:val="22"/>
-                <w:shd w:fill="auto" w:val="clear"/>
-                <w:lang w:val="ru-RU" w:eastAsia="en-US" w:bidi="ar-SA"/>
-              </w:rPr>
-              <w:t>isOrganization</w:t>
-            </w:r>
-            <w:r>
-              <w:rPr>
-                <w:rFonts w:eastAsia="Calibri" w:cs=""/>
-                <w:color w:themeColor="text1" w:val="000000"/>
-                <w:kern w:val="0"/>
-                <w:sz w:val="18"/>
-                <w:szCs w:val="22"/>
-                <w:shd w:fill="auto" w:val="clear"/>
-                <w:lang w:val="ru-RU" w:eastAsia="en-US" w:bidi="ar-SA"/>
-              </w:rPr>
-              <w:t>}{</w:t>
-            </w:r>
-            <w:r>
-              <w:rPr>
-                <w:rFonts w:eastAsia="Calibri" w:cs=""/>
-                <w:color w:themeColor="text1" w:val="000000"/>
-                <w:kern w:val="0"/>
-                <w:sz w:val="18"/>
-                <w:szCs w:val="22"/>
-                <w:shd w:fill="auto" w:val="clear"/>
-                <w:lang w:val="ru-RU" w:eastAsia="en-US" w:bidi="ar-SA"/>
-              </w:rPr>
-              <w:t>#isIndividualEntrepreneur</w:t>
-            </w:r>
-            <w:r>
-              <w:rPr>
-                <w:rFonts w:eastAsia="Calibri" w:cs=""/>
-                <w:color w:themeColor="text1" w:val="000000"/>
-                <w:kern w:val="0"/>
-                <w:sz w:val="18"/>
-                <w:szCs w:val="22"/>
-                <w:shd w:fill="auto" w:val="clear"/>
-                <w:lang w:val="ru-RU" w:eastAsia="en-US" w:bidi="ar-SA"/>
-              </w:rPr>
-              <w:t>}{agentDirectorName}{/</w:t>
-            </w:r>
-            <w:r>
-              <w:rPr>
-                <w:rFonts w:eastAsia="Calibri" w:cs=""/>
-                <w:color w:themeColor="text1" w:val="000000"/>
-                <w:kern w:val="0"/>
-                <w:sz w:val="18"/>
-                <w:szCs w:val="22"/>
-                <w:shd w:fill="auto" w:val="clear"/>
-                <w:lang w:val="ru-RU" w:eastAsia="en-US" w:bidi="ar-SA"/>
-              </w:rPr>
-              <w:t>isIndividualEntrepreneur</w:t>
-            </w:r>
-            <w:r>
-              <w:rPr>
-                <w:rFonts w:eastAsia="Calibri" w:cs=""/>
-                <w:color w:themeColor="text1" w:val="000000"/>
-                <w:kern w:val="0"/>
-                <w:sz w:val="18"/>
-                <w:szCs w:val="22"/>
-                <w:shd w:fill="auto" w:val="clear"/>
-                <w:lang w:val="ru-RU" w:eastAsia="en-US" w:bidi="ar-SA"/>
-              </w:rPr>
-              <w:t>}</w:t>
+              <w:t>{#isOrganization}{agentName}{/isOrganization}{#isIndividualEntrepreneur}{agentDirectorName}{/isIndividualEntrepreneur}</w:t>
             </w:r>
           </w:p>
         </w:tc>
@@ -1318,31 +1158,7 @@
                 <w:shd w:fill="auto" w:val="clear"/>
                 <w:lang w:val="ru-RU" w:eastAsia="en-US" w:bidi="ar-SA"/>
               </w:rPr>
-              <w:t>{</w:t>
-            </w:r>
-            <w:r>
-              <w:rPr>
-                <w:rFonts w:eastAsia="Calibri" w:cs=""/>
-                <w:color w:themeColor="text1" w:val="000000"/>
-                <w:kern w:val="0"/>
-                <w:sz w:val="18"/>
-                <w:szCs w:val="18"/>
-                <w:shd w:fill="auto" w:val="clear"/>
-                <w:lang w:val="ru-RU" w:eastAsia="en-US" w:bidi="ar-SA"/>
-              </w:rPr>
-              <w:t>orgName</w:t>
-            </w:r>
-            <w:r>
-              <w:rPr>
-                <w:rFonts w:eastAsia="Calibri" w:cs=""/>
-                <w:color w:themeColor="text1" w:val="000000"/>
-                <w:kern w:val="0"/>
-                <w:sz w:val="18"/>
-                <w:szCs w:val="18"/>
-                <w:shd w:fill="auto" w:val="clear"/>
-                <w:lang w:val="ru-RU" w:eastAsia="en-US" w:bidi="ar-SA"/>
-              </w:rPr>
-              <w:t>}, {inn}, {clientKpp}</w:t>
+              <w:t>{orgName}, {inn}, {clientKpp}</w:t>
             </w:r>
           </w:p>
         </w:tc>
@@ -1402,7 +1218,7 @@
               <wp:inline distT="0" distB="0" distL="0" distR="0">
                 <wp:extent cx="6652895" cy="20320"/>
                 <wp:effectExtent l="0" t="0" r="0" b="0"/>
-                <wp:docPr id="1" name="Shape1"/>
+                <wp:docPr id="2" name="Shape1"/>
                 <a:graphic xmlns:a="http://schemas.openxmlformats.org/drawingml/2006/main">
                   <a:graphicData uri="http://schemas.microsoft.com/office/word/2010/wordprocessingShape">
                     <wps:wsp>
@@ -1470,7 +1286,7 @@
             <wp:extent cx="1661795" cy="1661795"/>
             <wp:effectExtent l="0" t="0" r="0" b="0"/>
             <wp:wrapNone/>
-            <wp:docPr id="2" name="Рисунок 7" descr="{stamp}"/>
+            <wp:docPr id="3" name="Рисунок 7" descr="{stamp}"/>
             <wp:cNvGraphicFramePr>
               <a:graphicFrameLocks xmlns:a="http://schemas.openxmlformats.org/drawingml/2006/main" noChangeAspect="1"/>
             </wp:cNvGraphicFramePr>
@@ -1478,13 +1294,13 @@
               <a:graphicData uri="http://schemas.openxmlformats.org/drawingml/2006/picture">
                 <pic:pic xmlns:pic="http://schemas.openxmlformats.org/drawingml/2006/picture">
                   <pic:nvPicPr>
-                    <pic:cNvPr id="2" name="Рисунок 7" descr="{stamp}"/>
+                    <pic:cNvPr id="3" name="Рисунок 7" descr="{stamp}"/>
                     <pic:cNvPicPr>
                       <a:picLocks noChangeAspect="1" noChangeArrowheads="1"/>
                     </pic:cNvPicPr>
                   </pic:nvPicPr>
                   <pic:blipFill>
-                    <a:blip r:embed="rId2"/>
+                    <a:blip r:embed="rId3"/>
                     <a:stretch>
                       <a:fillRect/>
                     </a:stretch>
@@ -1535,10 +1351,10 @@
       </w:tblPr>
       <w:tblGrid>
         <w:gridCol w:w="1384"/>
-        <w:gridCol w:w="4250"/>
-        <w:gridCol w:w="2409"/>
-        <w:gridCol w:w="284"/>
-        <w:gridCol w:w="2355"/>
+        <w:gridCol w:w="4247"/>
+        <w:gridCol w:w="2411"/>
+        <w:gridCol w:w="282"/>
+        <w:gridCol w:w="2358"/>
       </w:tblGrid>
       <w:tr>
         <w:trPr/>
@@ -1582,7 +1398,7 @@
         </w:tc>
         <w:tc>
           <w:tcPr>
-            <w:tcW w:w="4250" w:type="dxa"/>
+            <w:tcW w:w="4247" w:type="dxa"/>
             <w:tcBorders>
               <w:top w:val="nil"/>
               <w:left w:val="nil"/>
@@ -1619,7 +1435,7 @@
                   <wp:extent cx="1038860" cy="1192530"/>
                   <wp:effectExtent l="0" t="0" r="0" b="0"/>
                   <wp:wrapNone/>
-                  <wp:docPr id="3" name="Рисунок 8" descr="{signature}"/>
+                  <wp:docPr id="4" name="Рисунок 8" descr="{signature}"/>
                   <wp:cNvGraphicFramePr>
                     <a:graphicFrameLocks xmlns:a="http://schemas.openxmlformats.org/drawingml/2006/main" noChangeAspect="1"/>
                   </wp:cNvGraphicFramePr>
@@ -1627,13 +1443,13 @@
                     <a:graphicData uri="http://schemas.openxmlformats.org/drawingml/2006/picture">
                       <pic:pic xmlns:pic="http://schemas.openxmlformats.org/drawingml/2006/picture">
                         <pic:nvPicPr>
-                          <pic:cNvPr id="3" name="Рисунок 8" descr="{signature}"/>
+                          <pic:cNvPr id="4" name="Рисунок 8" descr="{signature}"/>
                           <pic:cNvPicPr>
                             <a:picLocks noChangeAspect="1" noChangeArrowheads="1"/>
                           </pic:cNvPicPr>
                         </pic:nvPicPr>
                         <pic:blipFill>
-                          <a:blip r:embed="rId3"/>
+                          <a:blip r:embed="rId4"/>
                           <a:stretch>
                             <a:fillRect/>
                           </a:stretch>
@@ -1664,37 +1480,13 @@
                 <w:shd w:fill="auto" w:val="clear"/>
                 <w:lang w:val="ru-RU" w:eastAsia="en-US" w:bidi="ar-SA"/>
               </w:rPr>
-              <w:t>{agent</w:t>
-            </w:r>
-            <w:r>
-              <w:rPr>
-                <w:rFonts w:eastAsia="Calibri" w:cs=""/>
-                <w:color w:themeColor="text1" w:val="000000"/>
-                <w:kern w:val="0"/>
-                <w:sz w:val="18"/>
-                <w:szCs w:val="22"/>
-                <w:shd w:fill="auto" w:val="clear"/>
-                <w:lang w:val="ru-RU" w:eastAsia="en-US" w:bidi="ar-SA"/>
-              </w:rPr>
-              <w:t>Director</w:t>
-            </w:r>
-            <w:r>
-              <w:rPr>
-                <w:rFonts w:eastAsia="Calibri" w:cs=""/>
-                <w:color w:themeColor="text1" w:val="000000"/>
-                <w:kern w:val="0"/>
-                <w:sz w:val="18"/>
-                <w:szCs w:val="22"/>
-                <w:shd w:fill="auto" w:val="clear"/>
-                <w:lang w:val="ru-RU" w:eastAsia="en-US" w:bidi="ar-SA"/>
-              </w:rPr>
-              <w:t>Basis}</w:t>
-            </w:r>
-          </w:p>
-        </w:tc>
-        <w:tc>
-          <w:tcPr>
-            <w:tcW w:w="2409" w:type="dxa"/>
+              <w:t>{agentDirectorBasis}</w:t>
+            </w:r>
+          </w:p>
+        </w:tc>
+        <w:tc>
+          <w:tcPr>
+            <w:tcW w:w="2411" w:type="dxa"/>
             <w:tcBorders>
               <w:top w:val="nil"/>
               <w:left w:val="nil"/>
@@ -1728,7 +1520,7 @@
         </w:tc>
         <w:tc>
           <w:tcPr>
-            <w:tcW w:w="284" w:type="dxa"/>
+            <w:tcW w:w="282" w:type="dxa"/>
             <w:tcBorders>
               <w:top w:val="nil"/>
               <w:left w:val="nil"/>
@@ -1763,7 +1555,7 @@
         </w:tc>
         <w:tc>
           <w:tcPr>
-            <w:tcW w:w="2355" w:type="dxa"/>
+            <w:tcW w:w="2358" w:type="dxa"/>
             <w:tcBorders>
               <w:top w:val="nil"/>
               <w:left w:val="nil"/>
@@ -1867,7 +1659,7 @@
         </w:tc>
         <w:tc>
           <w:tcPr>
-            <w:tcW w:w="4250" w:type="dxa"/>
+            <w:tcW w:w="4247" w:type="dxa"/>
             <w:tcBorders>
               <w:left w:val="nil"/>
               <w:bottom w:val="nil"/>
@@ -1904,7 +1696,7 @@
         </w:tc>
         <w:tc>
           <w:tcPr>
-            <w:tcW w:w="2409" w:type="dxa"/>
+            <w:tcW w:w="2411" w:type="dxa"/>
             <w:tcBorders>
               <w:left w:val="nil"/>
               <w:bottom w:val="nil"/>
@@ -1941,7 +1733,7 @@
         </w:tc>
         <w:tc>
           <w:tcPr>
-            <w:tcW w:w="284" w:type="dxa"/>
+            <w:tcW w:w="282" w:type="dxa"/>
             <w:tcBorders>
               <w:top w:val="nil"/>
               <w:left w:val="nil"/>
@@ -1976,7 +1768,7 @@
         </w:tc>
         <w:tc>
           <w:tcPr>
-            <w:tcW w:w="2355" w:type="dxa"/>
+            <w:tcW w:w="2358" w:type="dxa"/>
             <w:tcBorders>
               <w:left w:val="nil"/>
               <w:bottom w:val="nil"/>
@@ -2037,9 +1829,9 @@
       </w:r>
     </w:p>
     <w:sectPr>
-      <w:footerReference w:type="even" r:id="rId4"/>
-      <w:footerReference w:type="default" r:id="rId5"/>
-      <w:footerReference w:type="first" r:id="rId6"/>
+      <w:footerReference w:type="even" r:id="rId5"/>
+      <w:footerReference w:type="default" r:id="rId6"/>
+      <w:footerReference w:type="first" r:id="rId7"/>
       <w:type w:val="nextPage"/>
       <w:pgSz w:w="11906" w:h="16838"/>
       <w:pgMar w:left="709" w:right="720" w:gutter="0" w:header="0" w:top="720" w:footer="227" w:bottom="720"/>

</xml_diff>